<commit_message>
Completar bono de población y clima con fuentes verificables
</commit_message>
<xml_diff>
--- a/Informe_primera_entrega_NYC.docx
+++ b/Informe_primera_entrega_NYC.docx
@@ -6014,6 +6014,368 @@
         </w:tc>
       </w:tr>
     </w:tbl>
+    <w:p>
+      <w:r>
+        <w:br w:type="page"/>
+      </w:r>
+    </w:p>
+    <w:p>
+      <w:pPr>
+        <w:pStyle w:val="Title"/>
+      </w:pPr>
+      <w:r>
+        <w:t>Anexo del bono  Población y clima</w:t>
+      </w:r>
+    </w:p>
+    <w:p>
+      <w:pPr>
+        <w:pStyle w:val="Heading1"/>
+      </w:pPr>
+      <w:r>
+        <w:t>Población obtenida de la página oficial</w:t>
+      </w:r>
+    </w:p>
+    <w:p>
+      <w:r>
+        <w:t>El enlace original de la consigna a neighborhoodpop.htm ya no está disponible. El sitio del Departamento de Salud del Estado de Nueva York publica ahora el tablero Population Estimates by County and Public Use Microdata Area. El programa lee el HTML de esa página, identifica el tablero incrustado y descarga su tabla pública en CSV. La extracción del 2 de octubre de 2026 contiene 195 filas: condado o agregado territorial por tres categorías de sexo. Se conservan el CSV bruto, su SHA-256 y la tabla de los cinco condados que corresponden a los boroughs de la ciudad.</w:t>
+      </w:r>
+    </w:p>
+    <w:p>
+      <w:r>
+        <w:t>La gráfica muestra población media anual del periodo 2019–2023. No es una proyección para 2026. Brooklyn registra 2 655 570 personas y Staten Island 494 308 en el tablero; las cifras se usan aquí como contexto y no como denominadores compatibles automáticamente con los arrestos de 2026.</w:t>
+      </w:r>
+    </w:p>
+    <w:tbl>
+      <w:tblPr>
+        <w:tblStyle w:val="LightShading-Accent1"/>
+        <w:tblW w:type="auto" w:w="0"/>
+        <w:tblLook w:firstColumn="1" w:firstRow="1" w:lastColumn="0" w:lastRow="0" w:noHBand="0" w:noVBand="1" w:val="04A0"/>
+      </w:tblPr>
+      <w:tblGrid>
+        <w:gridCol w:w="3255"/>
+        <w:gridCol w:w="3255"/>
+        <w:gridCol w:w="3255"/>
+      </w:tblGrid>
+      <w:tr>
+        <w:tc>
+          <w:tcPr>
+            <w:tcW w:type="dxa" w:w="3255"/>
+          </w:tcPr>
+          <w:p>
+            <w:r>
+              <w:t>Borough</w:t>
+            </w:r>
+          </w:p>
+        </w:tc>
+        <w:tc>
+          <w:tcPr>
+            <w:tcW w:type="dxa" w:w="3255"/>
+          </w:tcPr>
+          <w:p>
+            <w:r>
+              <w:t>Condado</w:t>
+            </w:r>
+          </w:p>
+        </w:tc>
+        <w:tc>
+          <w:tcPr>
+            <w:tcW w:type="dxa" w:w="3255"/>
+          </w:tcPr>
+          <w:p>
+            <w:r>
+              <w:t>Población media anual</w:t>
+            </w:r>
+          </w:p>
+        </w:tc>
+      </w:tr>
+      <w:tr>
+        <w:tc>
+          <w:tcPr>
+            <w:tcW w:type="dxa" w:w="3255"/>
+          </w:tcPr>
+          <w:p>
+            <w:r>
+              <w:t>Brooklyn</w:t>
+            </w:r>
+          </w:p>
+        </w:tc>
+        <w:tc>
+          <w:tcPr>
+            <w:tcW w:type="dxa" w:w="3255"/>
+          </w:tcPr>
+          <w:p>
+            <w:r>
+              <w:t>Kings</w:t>
+            </w:r>
+          </w:p>
+        </w:tc>
+        <w:tc>
+          <w:tcPr>
+            <w:tcW w:type="dxa" w:w="3255"/>
+          </w:tcPr>
+          <w:p>
+            <w:r>
+              <w:t>2 655 570</w:t>
+            </w:r>
+          </w:p>
+        </w:tc>
+      </w:tr>
+      <w:tr>
+        <w:tc>
+          <w:tcPr>
+            <w:tcW w:type="dxa" w:w="3255"/>
+          </w:tcPr>
+          <w:p>
+            <w:r>
+              <w:t>Queens</w:t>
+            </w:r>
+          </w:p>
+        </w:tc>
+        <w:tc>
+          <w:tcPr>
+            <w:tcW w:type="dxa" w:w="3255"/>
+          </w:tcPr>
+          <w:p>
+            <w:r>
+              <w:t>Queens</w:t>
+            </w:r>
+          </w:p>
+        </w:tc>
+        <w:tc>
+          <w:tcPr>
+            <w:tcW w:type="dxa" w:w="3255"/>
+          </w:tcPr>
+          <w:p>
+            <w:r>
+              <w:t>2 342 047</w:t>
+            </w:r>
+          </w:p>
+        </w:tc>
+      </w:tr>
+      <w:tr>
+        <w:tc>
+          <w:tcPr>
+            <w:tcW w:type="dxa" w:w="3255"/>
+          </w:tcPr>
+          <w:p>
+            <w:r>
+              <w:t>Manhattan</w:t>
+            </w:r>
+          </w:p>
+        </w:tc>
+        <w:tc>
+          <w:tcPr>
+            <w:tcW w:type="dxa" w:w="3255"/>
+          </w:tcPr>
+          <w:p>
+            <w:r>
+              <w:t>New York</w:t>
+            </w:r>
+          </w:p>
+        </w:tc>
+        <w:tc>
+          <w:tcPr>
+            <w:tcW w:type="dxa" w:w="3255"/>
+          </w:tcPr>
+          <w:p>
+            <w:r>
+              <w:t>1 638 025</w:t>
+            </w:r>
+          </w:p>
+        </w:tc>
+      </w:tr>
+      <w:tr>
+        <w:tc>
+          <w:tcPr>
+            <w:tcW w:type="dxa" w:w="3255"/>
+          </w:tcPr>
+          <w:p>
+            <w:r>
+              <w:t>Bronx</w:t>
+            </w:r>
+          </w:p>
+        </w:tc>
+        <w:tc>
+          <w:tcPr>
+            <w:tcW w:type="dxa" w:w="3255"/>
+          </w:tcPr>
+          <w:p>
+            <w:r>
+              <w:t>Bronx</w:t>
+            </w:r>
+          </w:p>
+        </w:tc>
+        <w:tc>
+          <w:tcPr>
+            <w:tcW w:type="dxa" w:w="3255"/>
+          </w:tcPr>
+          <w:p>
+            <w:r>
+              <w:t>1 423 729</w:t>
+            </w:r>
+          </w:p>
+        </w:tc>
+      </w:tr>
+      <w:tr>
+        <w:tc>
+          <w:tcPr>
+            <w:tcW w:type="dxa" w:w="3255"/>
+          </w:tcPr>
+          <w:p>
+            <w:r>
+              <w:t>Staten Island</w:t>
+            </w:r>
+          </w:p>
+        </w:tc>
+        <w:tc>
+          <w:tcPr>
+            <w:tcW w:type="dxa" w:w="3255"/>
+          </w:tcPr>
+          <w:p>
+            <w:r>
+              <w:t>Richmond</w:t>
+            </w:r>
+          </w:p>
+        </w:tc>
+        <w:tc>
+          <w:tcPr>
+            <w:tcW w:type="dxa" w:w="3255"/>
+          </w:tcPr>
+          <w:p>
+            <w:r>
+              <w:t>494 308</w:t>
+            </w:r>
+          </w:p>
+        </w:tc>
+      </w:tr>
+    </w:tbl>
+    <w:p>
+      <w:pPr>
+        <w:jc w:val="center"/>
+      </w:pPr>
+      <w:r>
+        <w:drawing>
+          <wp:inline xmlns:a="http://schemas.openxmlformats.org/drawingml/2006/main" xmlns:pic="http://schemas.openxmlformats.org/drawingml/2006/picture">
+            <wp:extent cx="5989320" cy="3359863"/>
+            <wp:docPr id="3" name="Picture 3"/>
+            <wp:cNvGraphicFramePr>
+              <a:graphicFrameLocks noChangeAspect="1"/>
+            </wp:cNvGraphicFramePr>
+            <a:graphic>
+              <a:graphicData uri="http://schemas.openxmlformats.org/drawingml/2006/picture">
+                <pic:pic>
+                  <pic:nvPicPr>
+                    <pic:cNvPr id="0" name="bono_poblacion_nyc.png"/>
+                    <pic:cNvPicPr/>
+                  </pic:nvPicPr>
+                  <pic:blipFill>
+                    <a:blip r:embed="rId12"/>
+                    <a:stretch>
+                      <a:fillRect/>
+                    </a:stretch>
+                  </pic:blipFill>
+                  <pic:spPr>
+                    <a:xfrm>
+                      <a:off x="0" y="0"/>
+                      <a:ext cx="5989320" cy="3359863"/>
+                    </a:xfrm>
+                    <a:prstGeom prst="rect"/>
+                  </pic:spPr>
+                </pic:pic>
+              </a:graphicData>
+            </a:graphic>
+          </wp:inline>
+        </w:drawing>
+      </w:r>
+    </w:p>
+    <w:p>
+      <w:pPr>
+        <w:pStyle w:val="Caption"/>
+      </w:pPr>
+      <w:r>
+        <w:t>Fuente: NYS Department of Health, Population Estimates by County and PUMA, tablero con estimaciones medias anuales 2019–2023; extracción propia del CSV público de Tableau. https://www.health.ny.gov/statistics/cancer/registry/population.htm</w:t>
+      </w:r>
+    </w:p>
+    <w:p>
+      <w:r>
+        <w:br w:type="page"/>
+      </w:r>
+    </w:p>
+    <w:p>
+      <w:pPr>
+        <w:pStyle w:val="Heading1"/>
+      </w:pPr>
+      <w:r>
+        <w:t>Clima consultado mediante API</w:t>
+      </w:r>
+    </w:p>
+    <w:p>
+      <w:r>
+        <w:t>La consigna enlaza la página principal de OpenWeatherMap. Su documentación exige una clave para cada solicitud de API; no había ninguna configurada en el entorno de ejecución. El proyecto incluye una consulta reproducible a Current Weather Data que se activa mediante la variable OPENWEATHER_API_KEY y guarda una observación solo cuando la autenticación funciona. Por tanto, no presentamos un resultado de OpenWeatherMap como ejecutado.</w:t>
+      </w:r>
+    </w:p>
+    <w:p>
+      <w:r>
+        <w:t>Para entregar una extracción climática real y verificable sin credenciales, consultamos la API histórica de Open-Meteo con el modelo de reanálisis ERA5. La solicitud cubre 1 826 días completos de 2021 a 2025 para las coordenadas 40,7128° N, 74,0060° O, zona America/New_York. La API devuelve la celda de modelo 40,75° N, 74,0° O. Calculamos para cada mes el promedio de la temperatura media diaria y el promedio entre años de la precipitación acumulada mensual. Es información de una celda de reanálisis, no de una estación puntual ni una serie causal de siniestros.</w:t>
+      </w:r>
+    </w:p>
+    <w:p>
+      <w:pPr>
+        <w:jc w:val="center"/>
+      </w:pPr>
+      <w:r>
+        <w:drawing>
+          <wp:inline xmlns:a="http://schemas.openxmlformats.org/drawingml/2006/main" xmlns:pic="http://schemas.openxmlformats.org/drawingml/2006/picture">
+            <wp:extent cx="5989320" cy="3279866"/>
+            <wp:docPr id="4" name="Picture 4"/>
+            <wp:cNvGraphicFramePr>
+              <a:graphicFrameLocks noChangeAspect="1"/>
+            </wp:cNvGraphicFramePr>
+            <a:graphic>
+              <a:graphicData uri="http://schemas.openxmlformats.org/drawingml/2006/picture">
+                <pic:pic>
+                  <pic:nvPicPr>
+                    <pic:cNvPr id="0" name="bono_clima_mensual.png"/>
+                    <pic:cNvPicPr/>
+                  </pic:nvPicPr>
+                  <pic:blipFill>
+                    <a:blip r:embed="rId13"/>
+                    <a:stretch>
+                      <a:fillRect/>
+                    </a:stretch>
+                  </pic:blipFill>
+                  <pic:spPr>
+                    <a:xfrm>
+                      <a:off x="0" y="0"/>
+                      <a:ext cx="5989320" cy="3279866"/>
+                    </a:xfrm>
+                    <a:prstGeom prst="rect"/>
+                  </pic:spPr>
+                </pic:pic>
+              </a:graphicData>
+            </a:graphic>
+          </wp:inline>
+        </w:drawing>
+      </w:r>
+    </w:p>
+    <w:p>
+      <w:pPr>
+        <w:pStyle w:val="Caption"/>
+      </w:pPr>
+      <w:r>
+        <w:t>Fuente: Open-Meteo Historical Weather API, modelo ERA5; consulta y agregación propias, 2021–2025. https://open-meteo.com/en/docs/historical-weather-api</w:t>
+      </w:r>
+    </w:p>
+    <w:p>
+      <w:r>
+        <w:t>En esta serie, julio tiene la temperatura media mensual más alta (25,79 °C) y noviembre la precipitación mensual media más baja (59,32 mm). Son resultados descriptivos de la fuente alternativa. El análisis de asociación con seguridad vial requeriría siniestros completos, fechas comparables, resolución espacial y control de exposición al tráfico.</w:t>
+      </w:r>
+    </w:p>
+    <w:p>
+      <w:r>
+        <w:t>Archivos reproducibles: scripts/bono_fuentes.py, datos/bono_poblacion_tabla.csv, datos/bono_poblacion_nyc.csv, datos/bono_clima_diario.csv, datos/bono_clima_mensual.csv, datos/bono_clima_openmeteo_era5.json y datos/bono_manifest.json.</w:t>
+      </w:r>
+    </w:p>
     <w:sectPr>
       <w:footerReference w:type="default" r:id="rId11"/>
       <w:pgSz w:w="12240" w:h="15840"/>

</xml_diff>